<commit_message>
Make every Evidence box heading + placeholder red across all TEMPLATE docs
Extends the red styling applied to doc 08's evidence box to all 20
other 'Evidence N -- [what to attach] / Drop the image under here.'
boxes across the 8 Portfolio and Remote Work Statement TEMPLATE files
(Employed, Self-Employed, Content Creator, Business Owner x2 doc
types each), for consistency with the site's established convention
that unfilled instructional text is red.

EXAMPLE files intentionally left unchanged -- their evidence boxes
already contain a real embedded image in place of the placeholder
text, so there's no unfilled instruction left to mark red; doing so
would look like a leftover editing artifact in a document meant to
represent a finished, genuine submission.
</commit_message>
<xml_diff>
--- a/document-templates/business-owner/02_Professional_Portfolio_Director_TEMPLATE.docx
+++ b/document-templates/business-owner/02_Professional_Portfolio_Director_TEMPLATE.docx
@@ -2565,6 +2565,7 @@
                 <w:rFonts w:ascii="Arial" w:cs="Arial" w:eastAsia="Arial" w:hAnsi="Arial"/>
                 <w:b/>
                 <w:bCs/>
+                <w:color w:val="C00000"/>
                 <w:sz w:val="21"/>
                 <w:szCs w:val="21"/>
               </w:rPr>
@@ -2580,7 +2581,7 @@
                 <w:rFonts w:ascii="Arial" w:cs="Arial" w:eastAsia="Arial" w:hAnsi="Arial"/>
                 <w:i/>
                 <w:iCs/>
-                <w:color w:val="595959"/>
+                <w:color w:val="C00000"/>
                 <w:sz w:val="18"/>
                 <w:szCs w:val="18"/>
               </w:rPr>
@@ -2647,6 +2648,7 @@
                 <w:rFonts w:ascii="Arial" w:cs="Arial" w:eastAsia="Arial" w:hAnsi="Arial"/>
                 <w:b/>
                 <w:bCs/>
+                <w:color w:val="C00000"/>
                 <w:sz w:val="21"/>
                 <w:szCs w:val="21"/>
               </w:rPr>
@@ -2662,7 +2664,7 @@
                 <w:rFonts w:ascii="Arial" w:cs="Arial" w:eastAsia="Arial" w:hAnsi="Arial"/>
                 <w:i/>
                 <w:iCs/>
-                <w:color w:val="595959"/>
+                <w:color w:val="C00000"/>
                 <w:sz w:val="18"/>
                 <w:szCs w:val="18"/>
               </w:rPr>

</xml_diff>